<commit_message>
Prepare privacy-safe public release v1.2 (root files)
</commit_message>
<xml_diff>
--- a/使用说明-请先阅读.docx
+++ b/使用说明-请先阅读.docx
@@ -473,7 +473,7 @@
           <w:rFonts w:ascii="Microsoft YaHei" w:hAnsi="Microsoft YaHei"/>
           <w:sz w:val="21"/>
         </w:rPr>
-        <w:t xml:space="preserve">CipherTalk 桌面版：本包已附带经过 SHA-256 校验的官方安装程序，可直接运行根目录的 </w:t>
+        <w:t xml:space="preserve">CipherTalk 桌面版：本包不附带安装程序；运行根目录的 </w:t>
       </w:r>
       <w:r>
         <w:rPr>
@@ -488,7 +488,7 @@
           <w:rFonts w:ascii="Microsoft YaHei" w:hAnsi="Microsoft YaHei"/>
           <w:sz w:val="21"/>
         </w:rPr>
-        <w:t>。</w:t>
+        <w:t xml:space="preserve"> 后会从官方 GitHub Release 下载并核验 SHA-256。</w:t>
       </w:r>
     </w:p>
     <w:p>
@@ -626,7 +626,7 @@
           <w:rFonts w:ascii="Microsoft YaHei" w:hAnsi="Microsoft YaHei"/>
           <w:sz w:val="21"/>
         </w:rPr>
-        <w:t>工具会先校验内附官方安装程序的 SHA-256；校验不一致时会停止，不允许继续。</w:t>
+        <w:t>阅读非商业许可和官方下载提示，确认后由工具从 CipherTalk 官方 GitHub Release 下载安装程序。</w:t>
       </w:r>
     </w:p>
     <w:p>
@@ -638,7 +638,19 @@
           <w:rFonts w:ascii="Microsoft YaHei" w:hAnsi="Microsoft YaHei"/>
           <w:sz w:val="21"/>
         </w:rPr>
-        <w:t>阅读非商业许可提示，确认后打开 CipherTalk 官方安装向导。</w:t>
+        <w:t>工具会核验固定 SHA-256；校验不一致时会停止并删除未通过校验的下载文件。</w:t>
+      </w:r>
+    </w:p>
+    <w:p>
+      <w:pPr>
+        <w:pStyle w:val="ListNumber"/>
+      </w:pPr>
+      <w:r>
+        <w:rPr>
+          <w:rFonts w:ascii="Microsoft YaHei" w:hAnsi="Microsoft YaHei"/>
+          <w:sz w:val="21"/>
+        </w:rPr>
+        <w:t>校验成功后打开 CipherTalk 官方安装向导。</w:t>
       </w:r>
     </w:p>
     <w:p>
@@ -698,7 +710,7 @@
           <w:rFonts w:ascii="Microsoft YaHei" w:hAnsi="Microsoft YaHei"/>
           <w:sz w:val="21"/>
         </w:rPr>
-        <w:t>内附版本信息：</w:t>
+        <w:t>支持版本与下载校验信息：</w:t>
       </w:r>
     </w:p>
     <w:p>
@@ -782,7 +794,7 @@
           <w:rFonts w:ascii="Consolas" w:hAnsi="Consolas"/>
           <w:sz w:val="18"/>
         </w:rPr>
-        <w:t>修改状态：未修改官方安装器</w:t>
+        <w:t>分发状态：本项目不内附或镜像该安装器</w:t>
       </w:r>
     </w:p>
     <w:p>
@@ -820,7 +832,7 @@
           <w:rFonts w:ascii="Microsoft YaHei" w:hAnsi="Microsoft YaHei"/>
           <w:sz w:val="21"/>
         </w:rPr>
-        <w:t>。如果电脑已经安装同版或更新版 CipherTalk，可以跳过本节；不要为了使用本包而降级已正常工作的更新版本。</w:t>
+        <w:t>。下载后的安装程序只保存在当前电脑中，已被 Git 和 Release 构建规则排除。如果电脑已经安装同版或更新版 CipherTalk，可以跳过本节；不要为了使用本包而降级已正常工作的更新版本。</w:t>
       </w:r>
     </w:p>
     <w:p>
@@ -1912,6 +1924,38 @@
           <w:rFonts w:ascii="Microsoft YaHei" w:hAnsi="Microsoft YaHei"/>
           <w:sz w:val="21"/>
         </w:rPr>
+        <w:t>先打开以下影刀分享页，获取“微信消息抓取3.0”并创建自己的流程副本：</w:t>
+      </w:r>
+    </w:p>
+    <w:p>
+      <w:pPr>
+        <w:pStyle w:val="NoSpacing"/>
+        <w:ind w:left="397"/>
+        <w:shd w:fill="F2F2F2"/>
+      </w:pPr>
+      <w:r>
+        <w:rPr>
+          <w:rFonts w:ascii="Consolas" w:hAnsi="Consolas"/>
+          <w:sz w:val="18"/>
+        </w:rPr>
+        <w:t>https://api.winrobot360.com/redirect/robot/share?inviteKey=dd2b99dec2af6ed9</w:t>
+      </w:r>
+    </w:p>
+    <w:p>
+      <w:r>
+        <w:rPr>
+          <w:rFonts w:ascii="Microsoft YaHei" w:hAnsi="Microsoft YaHei"/>
+          <w:sz w:val="21"/>
+        </w:rPr>
+        <w:t>分享流程不包含密钥、微信目录或消息数据。获取后仍必须按本节修改为接收者电脑上的实际路径和模块代码。</w:t>
+      </w:r>
+    </w:p>
+    <w:p>
+      <w:r>
+        <w:rPr>
+          <w:rFonts w:ascii="Microsoft YaHei" w:hAnsi="Microsoft YaHei"/>
+          <w:sz w:val="21"/>
+        </w:rPr>
         <w:t>导入收到的影刀流程后，不能直接运行。流程中的程序路径通常保留制作方电脑的绝对地址，必须换成本机路径。</w:t>
       </w:r>
     </w:p>
@@ -4126,14 +4170,14 @@
           <w:color w:val="1F4E79"/>
           <w:sz w:val="19"/>
         </w:rPr>
-        <w:t>wechat-rpa-portable-v1.0.zip</w:t>
+        <w:t>wechat-rpa-portable-v1.2.zip</w:t>
       </w:r>
       <w:r>
         <w:rPr>
           <w:rFonts w:ascii="Microsoft YaHei" w:hAnsi="Microsoft YaHei"/>
           <w:sz w:val="21"/>
         </w:rPr>
-        <w:t xml:space="preserve">。接收者必须用自己的信息重新运行 </w:t>
+        <w:t xml:space="preserve">。该 ZIP 不包含 CipherTalk 安装程序；接收者必须从官方来源下载，并用自己的信息重新运行 </w:t>
       </w:r>
       <w:r>
         <w:rPr>
@@ -4220,7 +4264,7 @@
           <w:rFonts w:ascii="Microsoft YaHei" w:hAnsi="Microsoft YaHei"/>
           <w:sz w:val="21"/>
         </w:rPr>
-        <w:t xml:space="preserve"> 安装 CipherTalk，或确认电脑已有可用的同版/更新版。</w:t>
+        <w:t xml:space="preserve"> 从官方来源下载并安装 CipherTalk，或确认电脑已有可用的同版/更新版。</w:t>
       </w:r>
     </w:p>
     <w:p>
@@ -4526,7 +4570,7 @@
         <w:color w:val="7F7F7F"/>
         <w:sz w:val="16"/>
       </w:rPr>
-      <w:t>微信消息采集便携版 · 内附 CipherTalk 官方安装器 · 仅限个人非商业用途</w:t>
+      <w:t>微信消息采集便携版 · 官方来源下载并校验 · 仅限个人非商业用途</w:t>
     </w:r>
   </w:p>
 </w:ftr>

</xml_diff>